<commit_message>
update title, team scope, and open-source work in resume and site
</commit_message>
<xml_diff>
--- a/resume/Jayesh_Kugsiya_Resume.docx
+++ b/resume/Jayesh_Kugsiya_Resume.docx
@@ -156,7 +156,7 @@
           <w:spacing w:val="0"/>
           <w:color w:val="0E0E0E"/>
         </w:rPr>
-        <w:t xml:space="preserve">Full-stack engineer with 5 years of building B2B SaaS and AI products from first commit to production. I head engineering at a commerce-software company. As a freelancer, I lead products for US clients and a chess academy with 10,000+ families. I own architecture, code, cloud infrastructure, and releases, with a focus on LLM features that stay reliable in production.</w:t>
+        <w:t xml:space="preserve">Full-stack engineer with 5 years of building B2B SaaS and AI products from first commit to production. I lead engineering at a commerce-software startup and lead products for US clients as a freelancer. I own architecture, code, cloud infrastructure, and releases, with a focus on reliable LLM features. My fixes ship in React Aria, Mantine, and Orval.</w:t>
       </w:r>
     </w:p>
     <w:p>
@@ -384,7 +384,7 @@
           <w:spacing w:val="0"/>
           <w:color w:val="0E0E0E"/>
         </w:rPr>
-        <w:t xml:space="preserve">Director &amp; Head of Engineering</w:t>
+        <w:t xml:space="preserve">Head of Engineering (Tech Lead)</w:t>
       </w:r>
     </w:p>
     <w:p>
@@ -674,7 +674,7 @@
           <w:spacing w:val="0"/>
           <w:color w:val="0E0E0E"/>
         </w:rPr>
-        <w:t xml:space="preserve">Lead releases, code review, and engineering standards, and mentor the developers.</w:t>
+        <w:t xml:space="preserve">Lead the team leads of a 25-developer engineering team, and own releases, code review, and standards.</w:t>
       </w:r>
     </w:p>
     <w:p>
@@ -690,6 +690,37 @@
         </w:rPr>
         <w:t xml:space="preserve">Freelance Lead Engineer</w:t>
       </w:r>
+      <w:r>
+        <w:rPr>
+          <w:rFonts w:ascii="Helvetica" w:hAnsi="Helvetica" w:cs="Helvetica"/>
+          <w:sz w:val="25"/>
+          <w:sz-cs w:val="25"/>
+          <w:spacing w:val="0"/>
+          <w:color w:val="0E0E0E"/>
+        </w:rPr>
+        <w:t xml:space="preserve"> </w:t>
+      </w:r>
+      <w:r>
+        <w:rPr>
+          <w:rFonts w:ascii="Helvetica" w:hAnsi="Helvetica" w:cs="Helvetica"/>
+          <w:sz w:val="25"/>
+          <w:sz-cs w:val="25"/>
+          <w:i/>
+          <w:spacing w:val="0"/>
+          <w:color w:val="0E0E0E"/>
+        </w:rPr>
+        <w:t xml:space="preserve">| Remote, for clients in the US and India</w:t>
+      </w:r>
+      <w:r>
+        <w:rPr>
+          <w:rFonts w:ascii="Helvetica" w:hAnsi="Helvetica" w:cs="Helvetica"/>
+          <w:sz w:val="25"/>
+          <w:sz-cs w:val="25"/>
+          <w:spacing w:val="0"/>
+          <w:color w:val="0E0E0E"/>
+        </w:rPr>
+        <w:t xml:space="preserve"/>
+      </w:r>
     </w:p>
     <w:p>
       <w:pPr/>
@@ -705,22 +736,6 @@
       </w:r>
     </w:p>
     <w:p>
-      <w:pPr>
-        <w:spacing w:after="20"/>
-      </w:pPr>
-      <w:r>
-        <w:rPr>
-          <w:rFonts w:ascii="Helvetica" w:hAnsi="Helvetica" w:cs="Helvetica"/>
-          <w:sz w:val="25"/>
-          <w:sz-cs w:val="25"/>
-          <w:i/>
-          <w:spacing w:val="0"/>
-          <w:color w:val="0E0E0E"/>
-        </w:rPr>
-        <w:t xml:space="preserve">Self-employed | Remote, for clients in the US and India</w:t>
-      </w:r>
-    </w:p>
-    <w:p>
       <w:pPr/>
       <w:r>
         <w:rPr>
@@ -919,65 +934,7 @@
           <w:spacing w:val="0"/>
           <w:color w:val="0E0E0E"/>
         </w:rPr>
-        <w:t xml:space="preserve">Lead developer on the academy's admin, coach, and student apps (Next.js, FastAPI, MongoDB).</w:t>
-      </w:r>
-    </w:p>
-    <w:p>
-      <w:pPr>
-        <w:ind w:left="720" w:first-line="-720"/>
-        <w:spacing w:after="30"/>
-      </w:pPr>
-      <w:r>
-        <w:rPr>
-          <w:rFonts w:ascii="Helvetica" w:hAnsi="Helvetica" w:cs="Helvetica"/>
-          <w:sz w:val="25"/>
-          <w:sz-cs w:val="25"/>
-          <w:color w:val="0E0E0E"/>
-        </w:rPr>
-        <w:t xml:space="preserve"/>
-        <w:tab/>
-        <w:t xml:space="preserve">•</w:t>
-        <w:tab/>
-        <w:t xml:space="preserve"/>
-      </w:r>
-      <w:r>
-        <w:rPr>
-          <w:rFonts w:ascii="Helvetica" w:hAnsi="Helvetica" w:cs="Helvetica"/>
-          <w:sz w:val="25"/>
-          <w:sz-cs w:val="25"/>
-          <w:spacing w:val="0"/>
-          <w:color w:val="0E0E0E"/>
-        </w:rPr>
-        <w:t xml:space="preserve">Built the chess curriculum: a shared PGN library with folders and search, plus a coach lesson board.</w:t>
-      </w:r>
-    </w:p>
-    <w:p>
-      <w:pPr>
-        <w:ind w:left="720" w:first-line="-720"/>
-        <w:spacing w:after="30"/>
-      </w:pPr>
-      <w:r>
-        <w:rPr>
-          <w:rFonts w:ascii="Helvetica" w:hAnsi="Helvetica" w:cs="Helvetica"/>
-          <w:sz w:val="25"/>
-          <w:sz-cs w:val="25"/>
-          <w:color w:val="0E0E0E"/>
-        </w:rPr>
-        <w:t xml:space="preserve"/>
-        <w:tab/>
-        <w:t xml:space="preserve">•</w:t>
-        <w:tab/>
-        <w:t xml:space="preserve"/>
-      </w:r>
-      <w:r>
-        <w:rPr>
-          <w:rFonts w:ascii="Helvetica" w:hAnsi="Helvetica" w:cs="Helvetica"/>
-          <w:sz w:val="25"/>
-          <w:sz-cs w:val="25"/>
-          <w:spacing w:val="0"/>
-          <w:color w:val="0E0E0E"/>
-        </w:rPr>
-        <w:t xml:space="preserve">Built chess puzzle quizzes with levels, scoring, time limits, analytics, and leaderboards.</w:t>
+        <w:t xml:space="preserve">Lead developer on the admin, coach, and student apps: lesson library, puzzle quizzes, and leaderboards.</w:t>
       </w:r>
     </w:p>
     <w:p>
@@ -1038,6 +995,237 @@
           <w:spacing w:val="0"/>
           <w:color w:val="0E0E0E"/>
         </w:rPr>
+        <w:t xml:space="preserve">7 merged pull requests in 2026</w:t>
+      </w:r>
+      <w:r>
+        <w:rPr>
+          <w:rFonts w:ascii="Helvetica" w:hAnsi="Helvetica" w:cs="Helvetica"/>
+          <w:sz w:val="25"/>
+          <w:sz-cs w:val="25"/>
+          <w:spacing w:val="0"/>
+          <w:color w:val="0E0E0E"/>
+        </w:rPr>
+        <w:t xml:space="preserve">, each with tests, reviewed and merged by the maintainers:</w:t>
+      </w:r>
+    </w:p>
+    <w:p>
+      <w:pPr>
+        <w:ind w:left="720" w:first-line="-720"/>
+        <w:spacing w:after="30"/>
+      </w:pPr>
+      <w:r>
+        <w:rPr>
+          <w:rFonts w:ascii="Helvetica" w:hAnsi="Helvetica" w:cs="Helvetica"/>
+          <w:sz w:val="25"/>
+          <w:sz-cs w:val="25"/>
+          <w:b/>
+          <w:color w:val="0E0E0E"/>
+        </w:rPr>
+        <w:t xml:space="preserve"/>
+        <w:tab/>
+        <w:t xml:space="preserve">•</w:t>
+        <w:tab/>
+        <w:t xml:space="preserve"/>
+      </w:r>
+      <w:r>
+        <w:rPr>
+          <w:rFonts w:ascii="Helvetica" w:hAnsi="Helvetica" w:cs="Helvetica"/>
+          <w:sz w:val="25"/>
+          <w:sz-cs w:val="25"/>
+          <w:b/>
+          <w:spacing w:val="0"/>
+          <w:color w:val="0E0E0E"/>
+        </w:rPr>
+        <w:t xml:space="preserve">React Aria (Adobe):</w:t>
+      </w:r>
+      <w:r>
+        <w:rPr>
+          <w:rFonts w:ascii="Helvetica" w:hAnsi="Helvetica" w:cs="Helvetica"/>
+          <w:sz w:val="25"/>
+          <w:sz-cs w:val="25"/>
+          <w:spacing w:val="0"/>
+          <w:color w:val="0E0E0E"/>
+        </w:rPr>
+        <w:t xml:space="preserve"> stopped the library from crashing on import in runtimes without a screen object, such as Deno.</w:t>
+      </w:r>
+    </w:p>
+    <w:p>
+      <w:pPr>
+        <w:ind w:left="720" w:first-line="-720"/>
+        <w:spacing w:after="30"/>
+      </w:pPr>
+      <w:r>
+        <w:rPr>
+          <w:rFonts w:ascii="Helvetica" w:hAnsi="Helvetica" w:cs="Helvetica"/>
+          <w:sz w:val="25"/>
+          <w:sz-cs w:val="25"/>
+          <w:b/>
+          <w:color w:val="0E0E0E"/>
+        </w:rPr>
+        <w:t xml:space="preserve"/>
+        <w:tab/>
+        <w:t xml:space="preserve">•</w:t>
+        <w:tab/>
+        <w:t xml:space="preserve"/>
+      </w:r>
+      <w:r>
+        <w:rPr>
+          <w:rFonts w:ascii="Helvetica" w:hAnsi="Helvetica" w:cs="Helvetica"/>
+          <w:sz w:val="25"/>
+          <w:sz-cs w:val="25"/>
+          <w:b/>
+          <w:spacing w:val="0"/>
+          <w:color w:val="0E0E0E"/>
+        </w:rPr>
+        <w:t xml:space="preserve">Mantine:</w:t>
+      </w:r>
+      <w:r>
+        <w:rPr>
+          <w:rFonts w:ascii="Helvetica" w:hAnsi="Helvetica" w:cs="Helvetica"/>
+          <w:sz w:val="25"/>
+          <w:sz-cs w:val="25"/>
+          <w:spacing w:val="0"/>
+          <w:color w:val="0E0E0E"/>
+        </w:rPr>
+        <w:t xml:space="preserve"> fixed Cascader keyboard navigation in right-to-left layouts, released in 9.7.3.</w:t>
+      </w:r>
+    </w:p>
+    <w:p>
+      <w:pPr>
+        <w:ind w:left="720" w:first-line="-720"/>
+        <w:spacing w:after="30"/>
+      </w:pPr>
+      <w:r>
+        <w:rPr>
+          <w:rFonts w:ascii="Helvetica" w:hAnsi="Helvetica" w:cs="Helvetica"/>
+          <w:sz w:val="25"/>
+          <w:sz-cs w:val="25"/>
+          <w:b/>
+          <w:color w:val="0E0E0E"/>
+        </w:rPr>
+        <w:t xml:space="preserve"/>
+        <w:tab/>
+        <w:t xml:space="preserve">•</w:t>
+        <w:tab/>
+        <w:t xml:space="preserve"/>
+      </w:r>
+      <w:r>
+        <w:rPr>
+          <w:rFonts w:ascii="Helvetica" w:hAnsi="Helvetica" w:cs="Helvetica"/>
+          <w:sz w:val="25"/>
+          <w:sz-cs w:val="25"/>
+          <w:b/>
+          <w:spacing w:val="0"/>
+          <w:color w:val="0E0E0E"/>
+        </w:rPr>
+        <w:t xml:space="preserve">Orval:</w:t>
+      </w:r>
+      <w:r>
+        <w:rPr>
+          <w:rFonts w:ascii="Helvetica" w:hAnsi="Helvetica" w:cs="Helvetica"/>
+          <w:sz w:val="25"/>
+          <w:sz-cs w:val="25"/>
+          <w:spacing w:val="0"/>
+          <w:color w:val="0E0E0E"/>
+        </w:rPr>
+        <w:t xml:space="preserve"> generated Zod schemas for shared responses, request bodies, and false schemas (2 pull requests).</w:t>
+      </w:r>
+    </w:p>
+    <w:p>
+      <w:pPr>
+        <w:ind w:left="720" w:first-line="-720"/>
+        <w:spacing w:after="30"/>
+      </w:pPr>
+      <w:r>
+        <w:rPr>
+          <w:rFonts w:ascii="Helvetica" w:hAnsi="Helvetica" w:cs="Helvetica"/>
+          <w:sz w:val="25"/>
+          <w:sz-cs w:val="25"/>
+          <w:b/>
+          <w:color w:val="0E0E0E"/>
+        </w:rPr>
+        <w:t xml:space="preserve"/>
+        <w:tab/>
+        <w:t xml:space="preserve">•</w:t>
+        <w:tab/>
+        <w:t xml:space="preserve"/>
+      </w:r>
+      <w:r>
+        <w:rPr>
+          <w:rFonts w:ascii="Helvetica" w:hAnsi="Helvetica" w:cs="Helvetica"/>
+          <w:sz w:val="25"/>
+          <w:sz-cs w:val="25"/>
+          <w:b/>
+          <w:spacing w:val="0"/>
+          <w:color w:val="0E0E0E"/>
+        </w:rPr>
+        <w:t xml:space="preserve">Conform:</w:t>
+      </w:r>
+      <w:r>
+        <w:rPr>
+          <w:rFonts w:ascii="Helvetica" w:hAnsi="Helvetica" w:cs="Helvetica"/>
+          <w:sz w:val="25"/>
+          <w:sz-cs w:val="25"/>
+          <w:spacing w:val="0"/>
+          <w:color w:val="0E0E0E"/>
+        </w:rPr>
+        <w:t xml:space="preserve"> let onBlur and onInput handlers cancel default behavior, released in 1.21.2, and fixed a flaky test.</w:t>
+      </w:r>
+    </w:p>
+    <w:p>
+      <w:pPr>
+        <w:ind w:left="720" w:first-line="-720"/>
+        <w:spacing w:after="30"/>
+      </w:pPr>
+      <w:r>
+        <w:rPr>
+          <w:rFonts w:ascii="Helvetica" w:hAnsi="Helvetica" w:cs="Helvetica"/>
+          <w:sz w:val="25"/>
+          <w:sz-cs w:val="25"/>
+          <w:b/>
+          <w:color w:val="0E0E0E"/>
+        </w:rPr>
+        <w:t xml:space="preserve"/>
+        <w:tab/>
+        <w:t xml:space="preserve">•</w:t>
+        <w:tab/>
+        <w:t xml:space="preserve"/>
+      </w:r>
+      <w:r>
+        <w:rPr>
+          <w:rFonts w:ascii="Helvetica" w:hAnsi="Helvetica" w:cs="Helvetica"/>
+          <w:sz w:val="25"/>
+          <w:sz-cs w:val="25"/>
+          <w:b/>
+          <w:spacing w:val="0"/>
+          <w:color w:val="0E0E0E"/>
+        </w:rPr>
+        <w:t xml:space="preserve">Actual Budget:</w:t>
+      </w:r>
+      <w:r>
+        <w:rPr>
+          <w:rFonts w:ascii="Helvetica" w:hAnsi="Helvetica" w:cs="Helvetica"/>
+          <w:sz w:val="25"/>
+          <w:sz-cs w:val="25"/>
+          <w:spacing w:val="0"/>
+          <w:color w:val="0E0E0E"/>
+        </w:rPr>
+        <w:t xml:space="preserve"> fixed moving budget categories between groups on mobile.</w:t>
+      </w:r>
+    </w:p>
+    <w:p>
+      <w:pPr>
+        <w:spacing w:after="60"/>
+      </w:pPr>
+      <w:r>
+        <w:rPr>
+          <w:rFonts w:ascii="Helvetica" w:hAnsi="Helvetica" w:cs="Helvetica"/>
+          <w:sz w:val="25"/>
+          <w:sz-cs w:val="25"/>
+          <w:b/>
+          <w:spacing w:val="0"/>
+          <w:color w:val="0E0E0E"/>
+        </w:rPr>
         <w:t xml:space="preserve">DeviceGate</w:t>
       </w:r>
       <w:r>
@@ -1048,7 +1236,7 @@
           <w:spacing w:val="0"/>
           <w:color w:val="0E0E0E"/>
         </w:rPr>
-        <w:t xml:space="preserve"> (MIT) | </w:t>
+        <w:t xml:space="preserve"> (MIT, </w:t>
       </w:r>
       <w:r>
         <w:rPr>
@@ -1068,9 +1256,7 @@
           <w:spacing w:val="0"/>
           <w:color w:val="0E0E0E"/>
         </w:rPr>
-        <w:t xml:space="preserve"/>
-        <w:br/>
-        <w:t xml:space="preserve">Self-hosted Claude Code gateway with per-device tokens, quotas, cost tracking, and audit logs.</w:t>
+        <w:t xml:space="preserve">): a self-hosted Claude Code gateway with device tokens and quotas.</w:t>
       </w:r>
     </w:p>
     <w:p>
@@ -1124,21 +1310,6 @@
           <w:color w:val="0E0E0E"/>
         </w:rPr>
         <w:t xml:space="preserve">2018 – 2022</w:t>
-      </w:r>
-    </w:p>
-    <w:p>
-      <w:pPr>
-        <w:spacing w:after="60"/>
-      </w:pPr>
-      <w:r>
-        <w:rPr>
-          <w:rFonts w:ascii="Helvetica" w:hAnsi="Helvetica" w:cs="Helvetica"/>
-          <w:sz w:val="25"/>
-          <w:sz-cs w:val="25"/>
-          <w:spacing w:val="0"/>
-          <w:color w:val="0E0E0E"/>
-        </w:rPr>
-        <w:t xml:space="preserve">Google Developer Student Clubs Lead. Built i3 Monuments, App of the Month on the JioGlass Store.</w:t>
       </w:r>
     </w:p>
     <w:sectPr/>

</xml_diff>